<commit_message>
Embed rendered architecture PNG in ARCHITECTURE.docx; add diagram source
</commit_message>
<xml_diff>
--- a/ARCHITECTURE.docx
+++ b/ARCHITECTURE.docx
@@ -2,7 +2,7 @@
 <file path=word/document.xml><?xml version="1.0" encoding="utf-8"?>
 <w:document xmlns:w="http://schemas.openxmlformats.org/wordprocessingml/2006/main" xmlns:m="http://schemas.openxmlformats.org/officeDocument/2006/math" xmlns:r="http://schemas.openxmlformats.org/officeDocument/2006/relationships" xmlns:o="urn:schemas-microsoft-com:office:office" xmlns:v="urn:schemas-microsoft-com:vml" xmlns:w10="urn:schemas-microsoft-com:office:word" xmlns:a="http://schemas.openxmlformats.org/drawingml/2006/main" xmlns:pic="http://schemas.openxmlformats.org/drawingml/2006/picture" xmlns:wp="http://schemas.openxmlformats.org/drawingml/2006/wordprocessingDrawing">
   <w:body>
-    <w:bookmarkStart w:id="22" w:name="stylefit--architecture"/>
+    <w:bookmarkStart w:id="25" w:name="stylefit-architecture"/>
     <w:p>
       <w:pPr>
         <w:pStyle w:val="Heading1"/>
@@ -11,7 +11,7 @@
         <w:t xml:space="preserve">StyleFit — Architecture</w:t>
       </w:r>
     </w:p>
-    <w:bookmarkStart w:id="9" w:name="Xc8951b796c7b61cbdd4998c72efbdeed0056e13"/>
+    <w:bookmarkStart w:id="9" w:name="overview"/>
     <w:p>
       <w:pPr>
         <w:pStyle w:val="Heading2"/>
@@ -101,7 +101,7 @@
       </w:r>
     </w:p>
     <w:bookmarkEnd w:id="9"/>
-    <w:bookmarkStart w:id="10" w:name="X7f8c9729302109eb8872ef9a44c642fc1f60efa"/>
+    <w:bookmarkStart w:id="10" w:name="tech-stack"/>
     <w:p>
       <w:pPr>
         <w:pStyle w:val="Heading2"/>
@@ -113,7 +113,8 @@
     <w:tbl>
       <w:tblPr>
         <w:tblStyle w:val="Table"/>
-        <w:tblW w:type="auto" w:w="0"/>
+        <w:tblW w:type="pct" w:w="5000"/>
+        <w:tblLayout w:type="fixed"/>
         <w:tblLook w:firstRow="1" w:lastRow="0" w:firstColumn="0" w:lastColumn="0" w:noHBand="0" w:noVBand="0" w:val="0020"/>
       </w:tblPr>
       <w:tblGrid>
@@ -391,7 +392,7 @@
       </w:r>
     </w:p>
     <w:bookmarkEnd w:id="10"/>
-    <w:bookmarkStart w:id="11" w:name="X4b35c4ddb7e350de24374151ddd79e140039918"/>
+    <w:bookmarkStart w:id="14" w:name="system-diagram"/>
     <w:p>
       <w:pPr>
         <w:pStyle w:val="Heading2"/>
@@ -402,308 +403,61 @@
     </w:p>
     <w:p>
       <w:pPr>
-        <w:pStyle w:val="SourceCode"/>
-      </w:pPr>
-      <w:r>
-        <w:rPr>
-          <w:rStyle w:val="VerbatimChar"/>
-        </w:rPr>
-        <w:t xml:space="preserve">flowchart LR</w:t>
-      </w:r>
-      <w:r>
-        <w:br/>
-      </w:r>
-      <w:r>
-        <w:rPr>
-          <w:rStyle w:val="VerbatimChar"/>
-        </w:rPr>
-        <w:t xml:space="preserve">  subgraph Browser["React + TypeScript (Vite)"]</w:t>
-      </w:r>
-      <w:r>
-        <w:br/>
-      </w:r>
-      <w:r>
-        <w:rPr>
-          <w:rStyle w:val="VerbatimChar"/>
-        </w:rPr>
-        <w:t xml:space="preserve">    UP[PhotoUpload]</w:t>
-      </w:r>
-      <w:r>
-        <w:br/>
-      </w:r>
-      <w:r>
-        <w:rPr>
-          <w:rStyle w:val="VerbatimChar"/>
-        </w:rPr>
-        <w:t xml:space="preserve">    DIM[DimensionsCard&lt;br/&gt;editable]</w:t>
-      </w:r>
-      <w:r>
-        <w:br/>
-      </w:r>
-      <w:r>
-        <w:rPr>
-          <w:rStyle w:val="VerbatimChar"/>
-        </w:rPr>
-        <w:t xml:space="preserve">    SP[StylePicker]</w:t>
-      </w:r>
-      <w:r>
-        <w:br/>
-      </w:r>
-      <w:r>
-        <w:rPr>
-          <w:rStyle w:val="VerbatimChar"/>
-        </w:rPr>
-        <w:t xml:space="preserve">    FL[Filters]</w:t>
-      </w:r>
-      <w:r>
-        <w:br/>
-      </w:r>
-      <w:r>
-        <w:rPr>
-          <w:rStyle w:val="VerbatimChar"/>
-        </w:rPr>
-        <w:t xml:space="preserve">    PG[ProductGrid]</w:t>
-      </w:r>
-      <w:r>
-        <w:br/>
-      </w:r>
-      <w:r>
-        <w:rPr>
-          <w:rStyle w:val="VerbatimChar"/>
-        </w:rPr>
-        <w:t xml:space="preserve">    CH[ChatPanel]</w:t>
-      </w:r>
-      <w:r>
-        <w:br/>
-      </w:r>
-      <w:r>
-        <w:rPr>
-          <w:rStyle w:val="VerbatimChar"/>
-        </w:rPr>
-        <w:t xml:space="preserve">  end</w:t>
-      </w:r>
-      <w:r>
-        <w:br/>
-      </w:r>
-      <w:r>
-        <w:br/>
-      </w:r>
-      <w:r>
-        <w:rPr>
-          <w:rStyle w:val="VerbatimChar"/>
-        </w:rPr>
-        <w:t xml:space="preserve">  subgraph Server["Express API (server-side only)"]</w:t>
-      </w:r>
-      <w:r>
-        <w:br/>
-      </w:r>
-      <w:r>
-        <w:rPr>
-          <w:rStyle w:val="VerbatimChar"/>
-        </w:rPr>
-        <w:t xml:space="preserve">    A[/POST /api/analyze/]</w:t>
-      </w:r>
-      <w:r>
-        <w:br/>
-      </w:r>
-      <w:r>
-        <w:rPr>
-          <w:rStyle w:val="VerbatimChar"/>
-        </w:rPr>
-        <w:t xml:space="preserve">    R[/POST /api/recommend/]</w:t>
-      </w:r>
-      <w:r>
-        <w:br/>
-      </w:r>
-      <w:r>
-        <w:rPr>
-          <w:rStyle w:val="VerbatimChar"/>
-        </w:rPr>
-        <w:t xml:space="preserve">    C[/POST /api/chat/]</w:t>
-      </w:r>
-      <w:r>
-        <w:br/>
-      </w:r>
-      <w:r>
-        <w:rPr>
-          <w:rStyle w:val="VerbatimChar"/>
-        </w:rPr>
-        <w:t xml:space="preserve">    V[vision.ts]</w:t>
-      </w:r>
-      <w:r>
-        <w:br/>
-      </w:r>
-      <w:r>
-        <w:rPr>
-          <w:rStyle w:val="VerbatimChar"/>
-        </w:rPr>
-        <w:t xml:space="preserve">    ST[stylist.ts]</w:t>
-      </w:r>
-      <w:r>
-        <w:br/>
-      </w:r>
-      <w:r>
-        <w:rPr>
-          <w:rStyle w:val="VerbatimChar"/>
-        </w:rPr>
-        <w:t xml:space="preserve">  end</w:t>
-      </w:r>
-      <w:r>
-        <w:br/>
-      </w:r>
-      <w:r>
-        <w:br/>
-      </w:r>
-      <w:r>
-        <w:rPr>
-          <w:rStyle w:val="VerbatimChar"/>
-        </w:rPr>
-        <w:t xml:space="preserve">  subgraph Catalog["Catalog layer (pluggable)"]</w:t>
-      </w:r>
-      <w:r>
-        <w:br/>
-      </w:r>
-      <w:r>
-        <w:rPr>
-          <w:rStyle w:val="VerbatimChar"/>
-        </w:rPr>
-        <w:t xml:space="preserve">    REG[registry.searchAll]</w:t>
-      </w:r>
-      <w:r>
-        <w:br/>
-      </w:r>
-      <w:r>
-        <w:rPr>
-          <w:rStyle w:val="VerbatimChar"/>
-        </w:rPr>
-        <w:t xml:space="preserve">    MOCK[MockCatalogAdapter]</w:t>
-      </w:r>
-      <w:r>
-        <w:br/>
-      </w:r>
-      <w:r>
-        <w:rPr>
-          <w:rStyle w:val="VerbatimChar"/>
-        </w:rPr>
-        <w:t xml:space="preserve">    EXT[Shopify / Amazon / … adapter]</w:t>
-      </w:r>
-      <w:r>
-        <w:br/>
-      </w:r>
-      <w:r>
-        <w:rPr>
-          <w:rStyle w:val="VerbatimChar"/>
-        </w:rPr>
-        <w:t xml:space="preserve">  end</w:t>
-      </w:r>
-      <w:r>
-        <w:br/>
-      </w:r>
-      <w:r>
-        <w:br/>
-      </w:r>
-      <w:r>
-        <w:rPr>
-          <w:rStyle w:val="VerbatimChar"/>
-        </w:rPr>
-        <w:t xml:space="preserve">  CLAUDE[["Claude (Opus 5)&lt;br/&gt;vision + reasoning"]]</w:t>
-      </w:r>
-      <w:r>
-        <w:br/>
-      </w:r>
-      <w:r>
-        <w:br/>
-      </w:r>
-      <w:r>
-        <w:rPr>
-          <w:rStyle w:val="VerbatimChar"/>
-        </w:rPr>
-        <w:t xml:space="preserve">  UP -- image base64 --&gt; A --&gt; V --&gt; CLAUDE</w:t>
-      </w:r>
-      <w:r>
-        <w:br/>
-      </w:r>
-      <w:r>
-        <w:rPr>
-          <w:rStyle w:val="VerbatimChar"/>
-        </w:rPr>
-        <w:t xml:space="preserve">  V -- dimensions, sizes, styles --&gt; DIM &amp; SP</w:t>
-      </w:r>
-      <w:r>
-        <w:br/>
-      </w:r>
-      <w:r>
-        <w:rPr>
-          <w:rStyle w:val="VerbatimChar"/>
-        </w:rPr>
-        <w:t xml:space="preserve">  SP -- styleId + query --&gt; R</w:t>
-      </w:r>
-      <w:r>
-        <w:br/>
-      </w:r>
-      <w:r>
-        <w:rPr>
-          <w:rStyle w:val="VerbatimChar"/>
-        </w:rPr>
-        <w:t xml:space="preserve">  FL -- filter query --&gt; R</w:t>
-      </w:r>
-      <w:r>
-        <w:br/>
-      </w:r>
-      <w:r>
-        <w:rPr>
-          <w:rStyle w:val="VerbatimChar"/>
-        </w:rPr>
-        <w:t xml:space="preserve">  R --&gt; REG --&gt; MOCK</w:t>
-      </w:r>
-      <w:r>
-        <w:br/>
-      </w:r>
-      <w:r>
-        <w:rPr>
-          <w:rStyle w:val="VerbatimChar"/>
-        </w:rPr>
-        <w:t xml:space="preserve">  REG -.-&gt; EXT</w:t>
-      </w:r>
-      <w:r>
-        <w:br/>
-      </w:r>
-      <w:r>
-        <w:rPr>
-          <w:rStyle w:val="VerbatimChar"/>
-        </w:rPr>
-        <w:t xml:space="preserve">  R -- products --&gt; ST --&gt; CLAUDE</w:t>
-      </w:r>
-      <w:r>
-        <w:br/>
-      </w:r>
-      <w:r>
-        <w:rPr>
-          <w:rStyle w:val="VerbatimChar"/>
-        </w:rPr>
-        <w:t xml:space="preserve">  ST -- ranked + fit reasons --&gt; PG</w:t>
-      </w:r>
-      <w:r>
-        <w:br/>
-      </w:r>
-      <w:r>
-        <w:rPr>
-          <w:rStyle w:val="VerbatimChar"/>
-        </w:rPr>
-        <w:t xml:space="preserve">  CH -- message + filters --&gt; C --&gt; ST</w:t>
-      </w:r>
-      <w:r>
-        <w:br/>
-      </w:r>
-      <w:r>
-        <w:rPr>
-          <w:rStyle w:val="VerbatimChar"/>
-        </w:rPr>
-        <w:t xml:space="preserve">  C -- reply + filter patch --&gt; CH -- merged query --&gt; R</w:t>
+        <w:pStyle w:val="CaptionedFigure"/>
+      </w:pPr>
+      <w:r>
+        <w:drawing>
+          <wp:inline>
+            <wp:extent cx="5334000" cy="2340428"/>
+            <wp:effectExtent b="0" l="0" r="0" t="0"/>
+            <wp:docPr descr="Architecture diagram" title="" id="12" name="Picture"/>
+            <a:graphic>
+              <a:graphicData uri="http://schemas.openxmlformats.org/drawingml/2006/picture">
+                <pic:pic>
+                  <pic:nvPicPr>
+                    <pic:cNvPr descr="docs/architecture-diagram.png" id="13" name="Picture"/>
+                    <pic:cNvPicPr>
+                      <a:picLocks noChangeArrowheads="1" noChangeAspect="1"/>
+                    </pic:cNvPicPr>
+                  </pic:nvPicPr>
+                  <pic:blipFill>
+                    <a:blip r:embed="rId11"/>
+                    <a:stretch>
+                      <a:fillRect/>
+                    </a:stretch>
+                  </pic:blipFill>
+                  <pic:spPr bwMode="auto">
+                    <a:xfrm>
+                      <a:off x="0" y="0"/>
+                      <a:ext cx="5334000" cy="2340428"/>
+                    </a:xfrm>
+                    <a:prstGeom prst="rect">
+                      <a:avLst/>
+                    </a:prstGeom>
+                    <a:noFill/>
+                    <a:ln w="9525">
+                      <a:noFill/>
+                      <a:headEnd/>
+                      <a:tailEnd/>
+                    </a:ln>
+                  </pic:spPr>
+                </pic:pic>
+              </a:graphicData>
+            </a:graphic>
+          </wp:inline>
+        </w:drawing>
       </w:r>
     </w:p>
-    <w:bookmarkEnd w:id="11"/>
-    <w:bookmarkStart w:id="12" w:name="X5afecc0ba93e4d870670069230b755ace2f2d8a"/>
+    <w:p>
+      <w:pPr>
+        <w:pStyle w:val="ImageCaption"/>
+      </w:pPr>
+      <w:r>
+        <w:t xml:space="preserve">Architecture diagram</w:t>
+      </w:r>
+    </w:p>
+    <w:bookmarkEnd w:id="14"/>
+    <w:bookmarkStart w:id="15" w:name="end-to-end-flow"/>
     <w:p>
       <w:pPr>
         <w:pStyle w:val="Heading2"/>
@@ -980,13 +734,40 @@
         <w:t xml:space="preserve"> </w:t>
       </w:r>
       <w:r>
-        <w:t xml:space="preserve">Claude interprets natural language ("cheaper", "ships this week", "more green",</w:t>
-      </w:r>
-      <w:r>
-        <w:t xml:space="preserve"> </w:t>
-      </w:r>
-      <w:r>
-        <w:t xml:space="preserve">"under $80") into a structured</w:t>
+        <w:t xml:space="preserve">Claude interprets natural language (</w:t>
+      </w:r>
+      <w:r>
+        <w:t xml:space="preserve">“cheaper”</w:t>
+      </w:r>
+      <w:r>
+        <w:t xml:space="preserve">,</w:t>
+      </w:r>
+      <w:r>
+        <w:t xml:space="preserve"> </w:t>
+      </w:r>
+      <w:r>
+        <w:t xml:space="preserve">“ships this week”</w:t>
+      </w:r>
+      <w:r>
+        <w:t xml:space="preserve">,</w:t>
+      </w:r>
+      <w:r>
+        <w:t xml:space="preserve"> </w:t>
+      </w:r>
+      <w:r>
+        <w:t xml:space="preserve">“more green”</w:t>
+      </w:r>
+      <w:r>
+        <w:t xml:space="preserve">,</w:t>
+      </w:r>
+      <w:r>
+        <w:t xml:space="preserve"> </w:t>
+      </w:r>
+      <w:r>
+        <w:t xml:space="preserve">“under $80”</w:t>
+      </w:r>
+      <w:r>
+        <w:t xml:space="preserve">) into a structured</w:t>
       </w:r>
       <w:r>
         <w:t xml:space="preserve"> </w:t>
@@ -1047,8 +828,8 @@
         <w:t xml:space="preserve">re-triggers a recommend.</w:t>
       </w:r>
     </w:p>
-    <w:bookmarkEnd w:id="12"/>
-    <w:bookmarkStart w:id="16" w:name="X4df666fbcf2ac4e1b33b8c59af5a9cb7b40061a"/>
+    <w:bookmarkEnd w:id="15"/>
+    <w:bookmarkStart w:id="19" w:name="component-responsibilities"/>
     <w:p>
       <w:pPr>
         <w:pStyle w:val="Heading2"/>
@@ -1057,7 +838,7 @@
         <w:t xml:space="preserve">5. Component responsibilities</w:t>
       </w:r>
     </w:p>
-    <w:bookmarkStart w:id="13" w:name="backend-server"/>
+    <w:bookmarkStart w:id="16" w:name="backend-server"/>
     <w:p>
       <w:pPr>
         <w:pStyle w:val="Heading3"/>
@@ -1078,7 +859,8 @@
     <w:tbl>
       <w:tblPr>
         <w:tblStyle w:val="Table"/>
-        <w:tblW w:type="auto" w:w="0"/>
+        <w:tblW w:type="pct" w:w="5000"/>
+        <w:tblLayout w:type="fixed"/>
         <w:tblLook w:firstRow="1" w:lastRow="0" w:firstColumn="0" w:lastColumn="0" w:noHBand="0" w:noVBand="0" w:val="0020"/>
       </w:tblPr>
       <w:tblGrid>
@@ -1455,8 +1237,8 @@
         </w:tc>
       </w:tr>
     </w:tbl>
-    <w:bookmarkEnd w:id="13"/>
-    <w:bookmarkStart w:id="14" w:name="frontend-src"/>
+    <w:bookmarkEnd w:id="16"/>
+    <w:bookmarkStart w:id="17" w:name="frontend-src"/>
     <w:p>
       <w:pPr>
         <w:pStyle w:val="Heading3"/>
@@ -1477,7 +1259,8 @@
     <w:tbl>
       <w:tblPr>
         <w:tblStyle w:val="Table"/>
-        <w:tblW w:type="auto" w:w="0"/>
+        <w:tblW w:type="pct" w:w="5000"/>
+        <w:tblLayout w:type="fixed"/>
         <w:tblLook w:firstRow="1" w:lastRow="0" w:firstColumn="0" w:lastColumn="0" w:noHBand="0" w:noVBand="0" w:val="0020"/>
       </w:tblPr>
       <w:tblGrid>
@@ -1758,8 +1541,8 @@
         </w:tc>
       </w:tr>
     </w:tbl>
-    <w:bookmarkEnd w:id="14"/>
-    <w:bookmarkStart w:id="15" w:name="shared-sharedtypests"/>
+    <w:bookmarkEnd w:id="17"/>
+    <w:bookmarkStart w:id="18" w:name="shared-sharedtypes.ts"/>
     <w:p>
       <w:pPr>
         <w:pStyle w:val="Heading3"/>
@@ -1869,9 +1652,9 @@
         <w:t xml:space="preserve">, and all API request/response payloads.</w:t>
       </w:r>
     </w:p>
-    <w:bookmarkEnd w:id="15"/>
-    <w:bookmarkEnd w:id="16"/>
-    <w:bookmarkStart w:id="17" w:name="Xf2df8df2222d565457579ebb0632ec30f43e676"/>
+    <w:bookmarkEnd w:id="18"/>
+    <w:bookmarkEnd w:id="19"/>
+    <w:bookmarkStart w:id="20" w:name="the-e-commerce-agnostic-seam"/>
     <w:p>
       <w:pPr>
         <w:pStyle w:val="Heading2"/>
@@ -2242,8 +2025,8 @@
         <w:t xml:space="preserve">never sinks the others.</w:t>
       </w:r>
     </w:p>
-    <w:bookmarkEnd w:id="17"/>
-    <w:bookmarkStart w:id="18" w:name="Xe5c4dab53943e91f7613dee5d415b14df82602f"/>
+    <w:bookmarkEnd w:id="20"/>
+    <w:bookmarkStart w:id="21" w:name="api-reference"/>
     <w:p>
       <w:pPr>
         <w:pStyle w:val="Heading2"/>
@@ -2255,7 +2038,8 @@
     <w:tbl>
       <w:tblPr>
         <w:tblStyle w:val="Table"/>
-        <w:tblW w:type="auto" w:w="0"/>
+        <w:tblW w:type="pct" w:w="5000"/>
+        <w:tblLayout w:type="fixed"/>
         <w:tblLook w:firstRow="1" w:lastRow="0" w:firstColumn="0" w:lastColumn="0" w:noHBand="0" w:noVBand="0" w:val="0020"/>
       </w:tblPr>
       <w:tblGrid>
@@ -2475,8 +2259,8 @@
         </w:tc>
       </w:tr>
     </w:tbl>
-    <w:bookmarkEnd w:id="18"/>
-    <w:bookmarkStart w:id="19" w:name="X383408593603ce0366300b888712196ee82f490"/>
+    <w:bookmarkEnd w:id="21"/>
+    <w:bookmarkStart w:id="22" w:name="configuration"/>
     <w:p>
       <w:pPr>
         <w:pStyle w:val="Heading2"/>
@@ -2505,7 +2289,8 @@
     <w:tbl>
       <w:tblPr>
         <w:tblStyle w:val="Table"/>
-        <w:tblW w:type="auto" w:w="0"/>
+        <w:tblW w:type="pct" w:w="5000"/>
+        <w:tblLayout w:type="fixed"/>
         <w:tblLook w:firstRow="1" w:lastRow="0" w:firstColumn="0" w:lastColumn="0" w:noHBand="0" w:noVBand="0" w:val="0020"/>
       </w:tblPr>
       <w:tblGrid>
@@ -2687,8 +2472,8 @@
         </w:tc>
       </w:tr>
     </w:tbl>
-    <w:bookmarkEnd w:id="19"/>
-    <w:bookmarkStart w:id="20" w:name="Xbed48201874464a80ac07154e8ee3b9d0176499"/>
+    <w:bookmarkEnd w:id="22"/>
+    <w:bookmarkStart w:id="23" w:name="build-verification-status"/>
     <w:p>
       <w:pPr>
         <w:pStyle w:val="Heading2"/>
@@ -2824,8 +2609,8 @@
         <w:t xml:space="preserve">.</w:t>
       </w:r>
     </w:p>
-    <w:bookmarkEnd w:id="20"/>
-    <w:bookmarkStart w:id="21" w:name="X8476d52aef04fdd8d68c8d0c6cee9d2e5aaa40e"/>
+    <w:bookmarkEnd w:id="23"/>
+    <w:bookmarkStart w:id="24" w:name="known-limits-production-considerations"/>
     <w:p>
       <w:pPr>
         <w:pStyle w:val="Heading2"/>
@@ -2985,14 +2770,15 @@
       <w:r>
         <w:t xml:space="preserve">prototype.</w:t>
       </w:r>
+      <w:r>
+        <w:t xml:space="preserve"> </w:t>
+      </w:r>
+      <w:r>
+        <w:t xml:space="preserve">```</w:t>
+      </w:r>
     </w:p>
-    <w:p>
-      <w:pPr>
-        <w:pStyle w:val="SourceCode"/>
-      </w:pPr>
-    </w:p>
-    <w:bookmarkEnd w:id="21"/>
-    <w:bookmarkEnd w:id="22"/>
+    <w:bookmarkEnd w:id="24"/>
+    <w:bookmarkEnd w:id="25"/>
     <w:sectPr>
       <w:footnotePr>
         <w:numRestart w:val="eachSect"/>

</xml_diff>